<commit_message>
GDV-Klausur: Überschneidungen mit Altklausur SS25 und Übungsklausur beseitigt
Co-Authored-By: Claude Opus 5.5 <noreply@anthropic.com>
Claude-Session: https://claude.ai/code/session_01QoMVd8DtkiQvG9ufo5MMve
</commit_message>
<xml_diff>
--- a/lehre/GDV_WS2627/Klausur_GDV_WS2627.docx
+++ b/lehre/GDV_WS2627/Klausur_GDV_WS2627.docx
@@ -961,7 +961,7 @@
                 <w:b w:val="false"/>
                 <w:bCs w:val="false"/>
               </w:rPr>
-              <w:t xml:space="preserve">Das BGB gehört zum Privatrecht.</w:t>
+              <w:t xml:space="preserve">Das Rechtsverhältnis zwischen einer Bürgerin und dem Finanzamt gehört zum öffentlichen Recht.</w:t>
             </w:r>
           </w:p>
         </w:tc>
@@ -1071,7 +1071,7 @@
                 <w:b w:val="false"/>
                 <w:bCs w:val="false"/>
               </w:rPr>
-              <w:t xml:space="preserve">§ 433 Abs. 2 BGB ist eine Anspruchsgrundlage.</w:t>
+              <w:t xml:space="preserve">§ 812 Abs. 1 S. 1 Alt. 1 BGB ist eine Anspruchsgrundlage.</w:t>
             </w:r>
           </w:p>
         </w:tc>
@@ -1401,7 +1401,7 @@
                 <w:b w:val="false"/>
                 <w:bCs w:val="false"/>
               </w:rPr>
-              <w:t xml:space="preserve">Die Warenauslage mit Preisschild im Schaufenster ist regelmäßig eine invitatio ad offerendum.</w:t>
+              <w:t xml:space="preserve">Empfangsbedürftige Willenserklärungen werden nach dem objektiven Empfängerhorizont ausgelegt.</w:t>
             </w:r>
           </w:p>
         </w:tc>
@@ -1511,7 +1511,7 @@
                 <w:b w:val="false"/>
                 <w:bCs w:val="false"/>
               </w:rPr>
-              <w:t xml:space="preserve">Eine Annahme unter Erweiterungen, Einschränkungen oder sonstigen Änderungen gilt als Ablehnung, verbunden mit einem neuen Antrag.</w:t>
+              <w:t xml:space="preserve">Eine Willenserklärung wird nicht wirksam, wenn dem Empfänger vorher oder gleichzeitig ein Widerruf zugeht.</w:t>
             </w:r>
           </w:p>
         </w:tc>
@@ -2032,7 +2032,7 @@
         <w:t xml:space="preserve">a. </w:t>
       </w:r>
       <w:r>
-        <w:t xml:space="preserve">Definieren Sie den Begriff „Anspruch“ und nennen Sie die Norm, in der er definiert ist.</w:t>
+        <w:t xml:space="preserve">Was versteht man unter Erklärungsbewusstsein? Nennen Sie ein Beispiel, in dem es fehlt.</w:t>
       </w:r>
       <w:r>
         <w:rPr>
@@ -2068,6 +2068,14 @@
     </w:p>
     <w:p>
       <w:pPr>
+        <w:spacing w:after="0"/>
+      </w:pPr>
+      <w:r>
+        <w:t xml:space="preserve"/>
+      </w:r>
+    </w:p>
+    <w:p>
+      <w:pPr>
         <w:keepNext/>
         <w:spacing w:after="120" w:before="0"/>
       </w:pPr>
@@ -2079,7 +2087,7 @@
         <w:t xml:space="preserve">b. </w:t>
       </w:r>
       <w:r>
-        <w:t xml:space="preserve">Nennen Sie die drei Prüfungsebenen der Anspruchsprüfung.</w:t>
+        <w:t xml:space="preserve">Nennen Sie die drei Anfechtungsgründe des § 119 BGB mit genauer Normangabe.</w:t>
       </w:r>
       <w:r>
         <w:rPr>
@@ -2134,7 +2142,7 @@
         <w:t xml:space="preserve">c. </w:t>
       </w:r>
       <w:r>
-        <w:t xml:space="preserve">Nennen Sie die drei Bestandteile des subjektiven Tatbestands einer Willenserklärung.</w:t>
+        <w:t xml:space="preserve">Wie viele Rechtsgeschäfte werden beim Barkauf eines Buches geschlossen? Benennen Sie sie mit Norm.</w:t>
       </w:r>
       <w:r>
         <w:rPr>
@@ -2189,7 +2197,7 @@
         <w:t xml:space="preserve">d. </w:t>
       </w:r>
       <w:r>
-        <w:t xml:space="preserve">In welchen Paragraphen des BGB sind „Verbraucher“ und „Unternehmer“ definiert?</w:t>
+        <w:t xml:space="preserve">Welche Rechtsfolge hat ein Verstoß eines Rechtsgeschäfts gegen ein gesetzliches Verbot? Nennen Sie die Norm.</w:t>
       </w:r>
       <w:r>
         <w:rPr>
@@ -2255,7 +2263,7 @@
         <w:t xml:space="preserve">a. </w:t>
       </w:r>
       <w:r>
-        <w:t xml:space="preserve">Die Studentin S bestellt am Montag, 01.02.2027, in einem Onlineshop des Händlers H (Unternehmer) neue Kopfhörer. Sie wird ordnungsgemäß über ihr Widerrufsrecht belehrt. Die Kopfhörer werden ihr am Donnerstag, 04.02.2027, geliefert.</w:t>
+        <w:t xml:space="preserve">Verbraucherin S bestellt am 01.02.2027 im Onlineshop des Unternehmers H einen Drucker, der ihr am 04.02.2027 geliefert wird. H belehrt S nicht über ihr Widerrufsrecht. Am 10.06.2027 erklärt S per E-Mail gegenüber H ohne Begründung den Widerruf.</w:t>
       </w:r>
     </w:p>
     <w:p>
@@ -2268,14 +2276,22 @@
           <w:b/>
           <w:bCs/>
         </w:rPr>
-        <w:t xml:space="preserve">Wann beginnt die Widerrufsfrist? Nennen Sie das maßgebliche Ereignis und die Paragraphen.</w:t>
+        <w:t xml:space="preserve">Hat S rechtzeitig widerrufen? (Stichworte und Paragraphen)</w:t>
       </w:r>
       <w:r>
         <w:rPr>
           <w:i/>
           <w:iCs/>
         </w:rPr>
-        <w:t xml:space="preserve"> (3 P.)</w:t>
+        <w:t xml:space="preserve"> (4 P.)</w:t>
+      </w:r>
+    </w:p>
+    <w:p>
+      <w:pPr>
+        <w:spacing w:after="0"/>
+      </w:pPr>
+      <w:r>
+        <w:t xml:space="preserve"/>
       </w:r>
     </w:p>
     <w:p>
@@ -2328,22 +2344,14 @@
           <w:b/>
           <w:bCs/>
         </w:rPr>
-        <w:t xml:space="preserve">Wann endet die Widerrufsfrist? Nennen Sie das Datum und die Paragraphen.</w:t>
+        <w:t xml:space="preserve">Welche Rechtsfolgen hat der wirksame Widerruf? (Stichworte und Paragraphen)</w:t>
       </w:r>
       <w:r>
         <w:rPr>
           <w:i/>
           <w:iCs/>
         </w:rPr>
-        <w:t xml:space="preserve"> (3 P.)</w:t>
-      </w:r>
-    </w:p>
-    <w:p>
-      <w:pPr>
-        <w:spacing w:after="0"/>
-      </w:pPr>
-      <w:r>
-        <w:t xml:space="preserve"/>
+        <w:t xml:space="preserve"> (2 P.)</w:t>
       </w:r>
     </w:p>
     <w:p>
@@ -2391,7 +2399,7 @@
         <w:t xml:space="preserve">b. </w:t>
       </w:r>
       <w:r>
-        <w:t xml:space="preserve">Der 22-jährige A bestellt ohne Wissen seiner Mitbewohnerin B und ausdrücklich in deren Namen beim Getränkehändler L eine Kiste Wein für 120 €. L weiß nicht, dass B nichts von der Bestellung weiß. Als L die Rechnung an B schickt, erklärt B, sie habe nichts bestellt und werde auch nichts bezahlen.</w:t>
+        <w:t xml:space="preserve">A ist Assistent des Unternehmers B. B bevollmächtigt ihn, für das Büro einen Laptop zu kaufen. A kauft beim Händler H einen Laptop für 1.200 € auf Rechnung. Dabei erwähnt er B mit keinem Wort. H geht davon aus, dass A für sich selbst kauft, und stellt die Rechnung auf A aus.</w:t>
       </w:r>
     </w:p>
     <w:p>
@@ -2404,7 +2412,7 @@
           <w:b/>
           <w:bCs/>
         </w:rPr>
-        <w:t xml:space="preserve">Von wem kann L Zahlung verlangen? (Stichworte und Paragraphen)</w:t>
+        <w:t xml:space="preserve">Mit wem ist der Kaufvertrag zustande gekommen, und von wem kann H Zahlung verlangen? (Stichworte und Paragraphen)</w:t>
       </w:r>
       <w:r>
         <w:rPr>
@@ -2491,7 +2499,7 @@
         <w:t xml:space="preserve">c. </w:t>
       </w:r>
       <w:r>
-        <w:t xml:space="preserve">Die 15-jährige M kauft ohne Wissen ihrer Eltern im Elektromarkt eine Spielkonsole für 450 €. Sie vereinbart mit dem Markt Ratenzahlung in neun Monatsraten zu je 50 €. Als die Eltern davon erfahren, erklären sie gegenüber dem Markt, dass sie mit dem Kauf nicht einverstanden sind.</w:t>
+        <w:t xml:space="preserve">Die 12-jährige M bekommt von ihrem Onkel O ein gebrauchtes Smartphone geschenkt und übereignet. Ihre Eltern wurden vorher nicht gefragt. Sie sind verärgert und erklären O gegenüber, dass sie mit dem Geschenk nicht einverstanden sind.</w:t>
       </w:r>
     </w:p>
     <w:p>
@@ -2504,7 +2512,7 @@
           <w:b/>
           <w:bCs/>
         </w:rPr>
-        <w:t xml:space="preserve">Ist der Kaufvertrag wirksam? (Stichworte und Paragraphen)</w:t>
+        <w:t xml:space="preserve">Ist der Schenkungsvertrag wirksam? (Stichworte und Paragraphen)</w:t>
       </w:r>
       <w:r>
         <w:rPr>
@@ -2702,7 +2710,7 @@
         <w:spacing w:after="120" w:before="0"/>
       </w:pPr>
       <w:r>
-        <w:t xml:space="preserve">V ist Privatperson und will sein gebrauchtes E-Bike verkaufen. Am Montag schreibt er seinem Bekannten K eine E-Mail: „Ich verkaufe dir mein E-Bike für 1.100 €. Gib mir bis Freitag Bescheid.“ Dabei hat sich V vertippt: Er wollte 1.900 € schreiben. Ein Preis von 1.100 € ist für ein solches Rad nicht ungewöhnlich, sodass K keinen Anlass hat, an der Angabe zu zweifeln.</w:t>
+        <w:t xml:space="preserve">H betreibt einen Fahrradladen. In seinem Schaufenster steht ein gebrauchtes Lastenrad mit einem Preisschild über 2.000 €. K, eine Privatperson, sieht das Rad am Montag und schreibt H am selben Abend eine E-Mail: „Ich kaufe das Lastenrad aus Ihrem Schaufenster für 2.000 €.“</w:t>
       </w:r>
     </w:p>
     <w:p>
@@ -2710,7 +2718,7 @@
         <w:spacing w:after="120" w:before="0"/>
       </w:pPr>
       <w:r>
-        <w:t xml:space="preserve">K antwortet am Mittwochmittag per E-Mail: „Einverstanden, ich nehme das E-Bike für 1.100 €.“ V liest die E-Mail am Mittwochabend und bemerkt dabei seinen Tippfehler. Am Donnerstagmorgen schreibt er K: „Ich habe mich vertippt, gemeint waren 1.900 €. Ich fechte meine Erklärung an.“</w:t>
+        <w:t xml:space="preserve">H antwortet am Dienstag per E-Mail: „Gern, allerdings nur für 2.200 €, weil ich den Akku noch austauschen musste.“ K antwortet darauf nicht. Am Freitag bringt H das Lastenrad zu K und verlangt 2.200 €. K lehnt die Annahme des Rades ab: Er habe einem Preis von 2.200 € nie zugestimmt. H meint, K müsse dann jedenfalls die 2.000 € zahlen, die er selbst angeboten habe.</w:t>
       </w:r>
     </w:p>
     <w:p>
@@ -2725,7 +2733,7 @@
         <w:t xml:space="preserve">Fallfrage: </w:t>
       </w:r>
       <w:r>
-        <w:t xml:space="preserve">Kann K von V Übergabe und Übereignung des E-Bikes gegen Zahlung von 1.100 € verlangen?</w:t>
+        <w:t xml:space="preserve">Kann H von K Zahlung von 2.200 € verlangen? Kann er jedenfalls Zahlung von 2.000 € verlangen?</w:t>
       </w:r>
     </w:p>
     <w:p>
@@ -2740,7 +2748,7 @@
         <w:t xml:space="preserve">Bearbeitervermerk: </w:t>
       </w:r>
       <w:r>
-        <w:t xml:space="preserve">Zur Fallfrage ist gutachterlich Stellung zu nehmen. Das Gutachten ist in ganzen Sätzen und unter Nennung der einschlägigen Paragraphen zu fertigen. Ansprüche des K auf Ersatz eines Vertrauensschadens sind nicht zu prüfen.</w:t>
+        <w:t xml:space="preserve">Zur Fallfrage ist gutachterlich Stellung zu nehmen. Das Gutachten ist in ganzen Sätzen und unter Nennung der einschlägigen Paragraphen zu fertigen. Ein Widerrufsrecht des K ist nicht zu prüfen.</w:t>
       </w:r>
     </w:p>
     <w:p>

</xml_diff>